<commit_message>
feat(ethical-hacking): add student id
</commit_message>
<xml_diff>
--- a/Year 1/Етичний хакінг/Lab_works/Lab_report_1.docx
+++ b/Year 1/Етичний хакінг/Lab_works/Lab_report_1.docx
@@ -270,6 +270,7 @@
                 <w:lang w:val="uk-UA"/>
               </w:rPr>
             </w:pPr>
+            <w:proofErr w:type="spellStart"/>
             <w:r>
               <w:rPr>
                 <w:rFonts w:ascii="Arial" w:hAnsi="Arial" w:cs="Arial"/>
@@ -277,7 +278,17 @@
                 <w:szCs w:val="22"/>
                 <w:lang w:val="uk-UA"/>
               </w:rPr>
-              <w:t>Білозор Дмитро</w:t>
+              <w:t>Білозор</w:t>
+            </w:r>
+            <w:proofErr w:type="spellEnd"/>
+            <w:r>
+              <w:rPr>
+                <w:rFonts w:ascii="Arial" w:hAnsi="Arial" w:cs="Arial"/>
+                <w:sz w:val="22"/>
+                <w:szCs w:val="22"/>
+                <w:lang w:val="uk-UA"/>
+              </w:rPr>
+              <w:t xml:space="preserve"> Дмитро</w:t>
             </w:r>
           </w:p>
         </w:tc>
@@ -347,7 +358,7 @@
                 <w:sz w:val="22"/>
                 <w:szCs w:val="22"/>
               </w:rPr>
-              <w:t>[Номер ID]</w:t>
+              <w:t>41639</w:t>
             </w:r>
           </w:p>
         </w:tc>
@@ -1044,16 +1055,7 @@
                 <w:sz w:val="22"/>
                 <w:szCs w:val="22"/>
               </w:rPr>
-              <w:t>192.168.64.3</w:t>
-            </w:r>
-            <w:r>
-              <w:rPr>
-                <w:rFonts w:ascii="Arial" w:eastAsia="Arial" w:hAnsi="Arial" w:cs="Arial"/>
-                <w:color w:val="1A1A1A"/>
-                <w:sz w:val="22"/>
-                <w:szCs w:val="22"/>
-              </w:rPr>
-              <w:t xml:space="preserve"> (Kali Linux)</w:t>
+              <w:t>192.168.64.3 (Kali Linux)</w:t>
             </w:r>
           </w:p>
         </w:tc>
@@ -2497,7 +2499,7 @@
           <w:szCs w:val="22"/>
         </w:rPr>
         <w:drawing>
-          <wp:inline distT="0" distB="0" distL="0" distR="0" wp14:anchorId="7BCC6077" wp14:editId="275CA43C">
+          <wp:inline distT="0" distB="0" distL="0" distR="0" wp14:anchorId="7BCC6077" wp14:editId="70F0BDE2">
             <wp:extent cx="5136204" cy="2170908"/>
             <wp:effectExtent l="0" t="0" r="0" b="1270"/>
             <wp:docPr id="1101081810" name="Picture 1" descr="A computer screen shot of a program&#10;&#10;AI-generated content may be incorrect."/>
@@ -3694,7 +3696,7 @@
           <w:szCs w:val="22"/>
         </w:rPr>
         <w:drawing>
-          <wp:inline distT="0" distB="0" distL="0" distR="0" wp14:anchorId="22F118B3" wp14:editId="04EE5BFE">
+          <wp:inline distT="0" distB="0" distL="0" distR="0" wp14:anchorId="22F118B3" wp14:editId="4A030557">
             <wp:extent cx="4893013" cy="3883077"/>
             <wp:effectExtent l="0" t="0" r="0" b="3175"/>
             <wp:docPr id="1499320008" name="Picture 6" descr="A computer screen shot of a computer program&#10;&#10;AI-generated content may be incorrect."/>
@@ -6668,7 +6670,7 @@
           <w:noProof/>
         </w:rPr>
         <w:drawing>
-          <wp:inline distT="0" distB="0" distL="0" distR="0" wp14:anchorId="418F5B0C" wp14:editId="395A40BF">
+          <wp:inline distT="0" distB="0" distL="0" distR="0" wp14:anchorId="418F5B0C" wp14:editId="78254CDF">
             <wp:extent cx="5731510" cy="4772660"/>
             <wp:effectExtent l="0" t="0" r="0" b="2540"/>
             <wp:docPr id="1607430699" name="Picture 7" descr="A computer screen shot of a program&#10;&#10;AI-generated content may be incorrect."/>
@@ -6956,7 +6958,7 @@
           <w:noProof/>
         </w:rPr>
         <w:drawing>
-          <wp:inline distT="0" distB="0" distL="0" distR="0" wp14:anchorId="305EDE30" wp14:editId="123C962F">
+          <wp:inline distT="0" distB="0" distL="0" distR="0" wp14:anchorId="305EDE30" wp14:editId="4360EB07">
             <wp:extent cx="5731510" cy="4384040"/>
             <wp:effectExtent l="0" t="0" r="0" b="0"/>
             <wp:docPr id="670026363" name="Picture 8" descr="A screenshot of a computer program&#10;&#10;AI-generated content may be incorrect."/>
@@ -9303,6 +9305,7 @@
                 <w:sz w:val="22"/>
                 <w:szCs w:val="22"/>
               </w:rPr>
+              <w:lastRenderedPageBreak/>
               <w:t xml:space="preserve">Опис: </w:t>
             </w:r>
             <w:r>
@@ -9344,6 +9347,7 @@
           <w:sz w:val="8"/>
           <w:szCs w:val="8"/>
         </w:rPr>
+        <w:lastRenderedPageBreak/>
         <w:t xml:space="preserve"> </w:t>
       </w:r>
     </w:p>
@@ -9398,7 +9402,6 @@
                 <w:sz w:val="24"/>
                 <w:szCs w:val="24"/>
               </w:rPr>
-              <w:lastRenderedPageBreak/>
               <w:t>2. Samba 3.0.20 — порти 139/445/tcp</w:t>
             </w:r>
             <w:r>
@@ -9884,6 +9887,7 @@
           <w:sz w:val="26"/>
           <w:szCs w:val="26"/>
         </w:rPr>
+        <w:lastRenderedPageBreak/>
         <w:t>8.2 — Рекомендації з захисту (Завдання 4.2)</w:t>
       </w:r>
       <w:r>
@@ -10074,7 +10078,6 @@
                 <w:rFonts w:ascii="Arial" w:eastAsia="Arial" w:hAnsi="Arial" w:cs="Arial"/>
                 <w:color w:val="1A1A1A"/>
               </w:rPr>
-              <w:lastRenderedPageBreak/>
               <w:t>vsftpd 2.3.4 (порт 21)</w:t>
             </w:r>
           </w:p>
@@ -10631,6 +10634,7 @@
           <w:sz w:val="22"/>
           <w:szCs w:val="22"/>
         </w:rPr>
+        <w:lastRenderedPageBreak/>
         <w:t>[4] National Vulnerability Database. CVE-2011-2523 (vsftpd 2.3.4). https://nvd.nist.gov/</w:t>
       </w:r>
     </w:p>
@@ -10687,7 +10691,6 @@
           <w:sz w:val="22"/>
           <w:szCs w:val="22"/>
         </w:rPr>
-        <w:lastRenderedPageBreak/>
         <w:t>[8] Закон Республіки Казахстан «Про інформаційну безпеку», 2023 р.</w:t>
       </w:r>
     </w:p>

</xml_diff>